<commit_message>
gant chart ve sprint 4 review düzenlendi, meeting notes ve test yöntemleri eklendi.
</commit_message>
<xml_diff>
--- a/Docs/Sprint Reports/Sprint_4.docx
+++ b/Docs/Sprint Reports/Sprint_4.docx
@@ -270,7 +270,7 @@
           <w:szCs w:val="40"/>
           <w:rtl w:val="0"/>
         </w:rPr>
-        <w:t xml:space="preserve">Sprint 3 Review</w:t>
+        <w:t xml:space="preserve">Sprint 4 Review</w:t>
       </w:r>
     </w:p>
     <w:p>
@@ -290,7 +290,7 @@
           <w:szCs w:val="32"/>
           <w:rtl w:val="0"/>
         </w:rPr>
-        <w:t xml:space="preserve">Nov 7, 2025 - Nov 19, 2025</w:t>
+        <w:t xml:space="preserve">Nov 25, 2025 - Dec 3, 2025</w:t>
       </w:r>
     </w:p>
     <w:p>
@@ -509,7 +509,7 @@
     </w:p>
     <w:p>
       <w:pPr>
-        <w:ind w:left="0" w:firstLine="0"/>
+        <w:ind w:left="0" w:firstLine="720"/>
         <w:rPr>
           <w:rFonts w:ascii="Times New Roman" w:cs="Times New Roman" w:eastAsia="Times New Roman" w:hAnsi="Times New Roman"/>
         </w:rPr>
@@ -749,6 +749,45 @@
                   <w:u w:val="single"/>
                   <w:rtl w:val="0"/>
                 </w:rPr>
+                <w:t xml:space="preserve">Meeting Notes - Sprint 4</w:t>
+              </w:r>
+            </w:hyperlink>
+            <w:r>
+              <w:rPr>
+                <w:rtl w:val="0"/>
+              </w:rPr>
+            </w:r>
+          </w:p>
+          <w:p>
+            <w:pPr>
+              <w:widowControl w:val="0"/>
+              <w:spacing w:line="240" w:lineRule="auto"/>
+              <w:rPr>
+                <w:rFonts w:ascii="Times New Roman" w:cs="Times New Roman" w:eastAsia="Times New Roman" w:hAnsi="Times New Roman"/>
+              </w:rPr>
+            </w:pPr>
+            <w:r>
+              <w:rPr>
+                <w:rtl w:val="0"/>
+              </w:rPr>
+            </w:r>
+          </w:p>
+          <w:p>
+            <w:pPr>
+              <w:widowControl w:val="0"/>
+              <w:spacing w:line="240" w:lineRule="auto"/>
+              <w:rPr>
+                <w:rFonts w:ascii="Times New Roman" w:cs="Times New Roman" w:eastAsia="Times New Roman" w:hAnsi="Times New Roman"/>
+              </w:rPr>
+            </w:pPr>
+            <w:hyperlink r:id="rId9">
+              <w:r>
+                <w:rPr>
+                  <w:rFonts w:ascii="Times New Roman" w:cs="Times New Roman" w:eastAsia="Times New Roman" w:hAnsi="Times New Roman"/>
+                  <w:color w:val="0000ee"/>
+                  <w:u w:val="single"/>
+                  <w:rtl w:val="0"/>
+                </w:rPr>
                 <w:t xml:space="preserve">IEEE_STP v1.0.docx</w:t>
               </w:r>
             </w:hyperlink>
@@ -766,7 +805,7 @@
                 <w:rFonts w:ascii="Times New Roman" w:cs="Times New Roman" w:eastAsia="Times New Roman" w:hAnsi="Times New Roman"/>
               </w:rPr>
             </w:pPr>
-            <w:hyperlink r:id="rId9">
+            <w:hyperlink r:id="rId10">
               <w:r>
                 <w:rPr>
                   <w:rFonts w:ascii="Times New Roman" w:cs="Times New Roman" w:eastAsia="Times New Roman" w:hAnsi="Times New Roman"/>
@@ -791,7 +830,7 @@
                 <w:rFonts w:ascii="Times New Roman" w:cs="Times New Roman" w:eastAsia="Times New Roman" w:hAnsi="Times New Roman"/>
               </w:rPr>
             </w:pPr>
-            <w:hyperlink r:id="rId10">
+            <w:hyperlink r:id="rId11">
               <w:r>
                 <w:rPr>
                   <w:rFonts w:ascii="Times New Roman" w:cs="Times New Roman" w:eastAsia="Times New Roman" w:hAnsi="Times New Roman"/>
@@ -816,12 +855,21 @@
                 <w:rFonts w:ascii="Times New Roman" w:cs="Times New Roman" w:eastAsia="Times New Roman" w:hAnsi="Times New Roman"/>
               </w:rPr>
             </w:pPr>
-            <w:r>
-              <w:rPr>
-                <w:rFonts w:ascii="Times New Roman" w:cs="Times New Roman" w:eastAsia="Times New Roman" w:hAnsi="Times New Roman"/>
-                <w:rtl w:val="0"/>
-              </w:rPr>
-              <w:t xml:space="preserve">@Integration unit test</w:t>
+            <w:hyperlink r:id="rId12">
+              <w:r>
+                <w:rPr>
+                  <w:rFonts w:ascii="Times New Roman" w:cs="Times New Roman" w:eastAsia="Times New Roman" w:hAnsi="Times New Roman"/>
+                  <w:color w:val="0000ee"/>
+                  <w:u w:val="single"/>
+                  <w:rtl w:val="0"/>
+                </w:rPr>
+                <w:t xml:space="preserve">Integration, Unit and System Test Definitions.docx</w:t>
+              </w:r>
+            </w:hyperlink>
+            <w:r>
+              <w:rPr>
+                <w:rtl w:val="0"/>
+              </w:rPr>
             </w:r>
           </w:p>
           <w:p>
@@ -846,7 +894,7 @@
                 <w:rFonts w:ascii="Times New Roman" w:cs="Times New Roman" w:eastAsia="Times New Roman" w:hAnsi="Times New Roman"/>
               </w:rPr>
             </w:pPr>
-            <w:hyperlink r:id="rId11">
+            <w:hyperlink r:id="rId13">
               <w:r>
                 <w:rPr>
                   <w:rFonts w:ascii="Times New Roman" w:cs="Times New Roman" w:eastAsia="Times New Roman" w:hAnsi="Times New Roman"/>
@@ -871,7 +919,7 @@
                 <w:rFonts w:ascii="Times New Roman" w:cs="Times New Roman" w:eastAsia="Times New Roman" w:hAnsi="Times New Roman"/>
               </w:rPr>
             </w:pPr>
-            <w:hyperlink r:id="rId12">
+            <w:hyperlink r:id="rId14">
               <w:r>
                 <w:rPr>
                   <w:rFonts w:ascii="Times New Roman" w:cs="Times New Roman" w:eastAsia="Times New Roman" w:hAnsi="Times New Roman"/>
@@ -896,7 +944,7 @@
                 <w:rFonts w:ascii="Times New Roman" w:cs="Times New Roman" w:eastAsia="Times New Roman" w:hAnsi="Times New Roman"/>
               </w:rPr>
             </w:pPr>
-            <w:hyperlink r:id="rId13">
+            <w:hyperlink r:id="rId15">
               <w:r>
                 <w:rPr>
                   <w:rFonts w:ascii="Times New Roman" w:cs="Times New Roman" w:eastAsia="Times New Roman" w:hAnsi="Times New Roman"/>
@@ -1731,49 +1779,6 @@
     </w:p>
     <w:p>
       <w:pPr>
-        <w:jc w:val="both"/>
-        <w:rPr>
-          <w:rFonts w:ascii="Times New Roman" w:cs="Times New Roman" w:eastAsia="Times New Roman" w:hAnsi="Times New Roman"/>
-        </w:rPr>
-      </w:pPr>
-      <w:r>
-        <w:rPr>
-          <w:rtl w:val="0"/>
-        </w:rPr>
-      </w:r>
-    </w:p>
-    <w:p>
-      <w:pPr>
-        <w:jc w:val="both"/>
-        <w:rPr>
-          <w:rFonts w:ascii="Times New Roman" w:cs="Times New Roman" w:eastAsia="Times New Roman" w:hAnsi="Times New Roman"/>
-          <w:sz w:val="32"/>
-          <w:szCs w:val="32"/>
-        </w:rPr>
-      </w:pPr>
-      <w:r>
-        <w:rPr>
-          <w:rtl w:val="0"/>
-        </w:rPr>
-      </w:r>
-    </w:p>
-    <w:p>
-      <w:pPr>
-        <w:jc w:val="both"/>
-        <w:rPr>
-          <w:rFonts w:ascii="Times New Roman" w:cs="Times New Roman" w:eastAsia="Times New Roman" w:hAnsi="Times New Roman"/>
-          <w:sz w:val="32"/>
-          <w:szCs w:val="32"/>
-        </w:rPr>
-      </w:pPr>
-      <w:r>
-        <w:rPr>
-          <w:rtl w:val="0"/>
-        </w:rPr>
-      </w:r>
-    </w:p>
-    <w:p>
-      <w:pPr>
         <w:pStyle w:val="Heading2"/>
         <w:numPr>
           <w:ilvl w:val="0"/>
@@ -2427,7 +2432,7 @@
           <w:rFonts w:ascii="Times New Roman" w:cs="Times New Roman" w:eastAsia="Times New Roman" w:hAnsi="Times New Roman"/>
           <w:rtl w:val="0"/>
         </w:rPr>
-        <w:t xml:space="preserve">Proposed sprint goal is finalizing and deliver the project's quality model and management artifacts so the system can be assessed against agreed quality metrics. Complete and hand over the Quality Management Plan (QMP) v1.0 and final control lists, update the architecture as needed, and run system acceptance tests to produce a signed quality review.</w:t>
+        <w:t xml:space="preserve">The proposed sprint goal is finalizing and delivering the project's quality model and management artifacts so the system can be assessed against agreed quality metrics. Complete and hand over the Quality Management Plan (QMP) v1.0 and final control lists, update the architecture as needed, and run system acceptance tests to produce a signed quality review.</w:t>
       </w:r>
     </w:p>
     <w:p>
@@ -3375,6 +3380,34 @@
         </w:tc>
       </w:tr>
     </w:tbl>
+    <w:p>
+      <w:pPr>
+        <w:ind w:left="0" w:firstLine="0"/>
+        <w:jc w:val="both"/>
+        <w:rPr>
+          <w:rFonts w:ascii="Times New Roman" w:cs="Times New Roman" w:eastAsia="Times New Roman" w:hAnsi="Times New Roman"/>
+        </w:rPr>
+      </w:pPr>
+      <w:r>
+        <w:rPr>
+          <w:rtl w:val="0"/>
+        </w:rPr>
+      </w:r>
+    </w:p>
+    <w:p>
+      <w:pPr>
+        <w:ind w:left="0" w:firstLine="0"/>
+        <w:jc w:val="both"/>
+        <w:rPr>
+          <w:rFonts w:ascii="Times New Roman" w:cs="Times New Roman" w:eastAsia="Times New Roman" w:hAnsi="Times New Roman"/>
+        </w:rPr>
+      </w:pPr>
+      <w:r>
+        <w:rPr>
+          <w:rtl w:val="0"/>
+        </w:rPr>
+      </w:r>
+    </w:p>
     <w:p>
       <w:pPr>
         <w:ind w:left="0" w:firstLine="0"/>

</xml_diff>